<commit_message>
Corrected description of COMPARED iCode
</commit_message>
<xml_diff>
--- a/compiler-internals/ICode2v0.docx
+++ b/compiler-internals/ICode2v0.docx
@@ -4926,7 +4926,21 @@
                 <w:rStyle w:val="Hyperlink"/>
                 <w:noProof/>
               </w:rPr>
-              <w:t>COMPARED</w:t>
+              <w:t>COMPAR</w:t>
+            </w:r>
+            <w:r>
+              <w:rPr>
+                <w:rStyle w:val="Hyperlink"/>
+                <w:noProof/>
+              </w:rPr>
+              <w:t>E</w:t>
+            </w:r>
+            <w:r>
+              <w:rPr>
+                <w:rStyle w:val="Hyperlink"/>
+                <w:noProof/>
+              </w:rPr>
+              <w:t>D</w:t>
             </w:r>
             <w:r>
               <w:rPr>
@@ -10682,10 +10696,18 @@
     </w:p>
     <w:p>
       <w:r>
-        <w:t>This is s</w:t>
+        <w:t xml:space="preserve">This is </w:t>
+      </w:r>
+      <w:proofErr w:type="gramStart"/>
+      <w:r>
+        <w:t>s</w:t>
       </w:r>
       <w:r>
-        <w:t>imilar to that generated from the code fragment: if B then A := C else  A := D;</w:t>
+        <w:t>imilar to</w:t>
+      </w:r>
+      <w:proofErr w:type="gramEnd"/>
+      <w:r>
+        <w:t xml:space="preserve"> that generated from the code fragment: if B then A := C else  A := D;</w:t>
       </w:r>
     </w:p>
     <w:p>
@@ -11207,7 +11229,21 @@
               <w:rPr>
                 <w:rFonts w:cs="Courier New"/>
               </w:rPr>
-              <w:t>This flag need not exist in the target machine but is defined in order to simplify the definitions of certain instructions.</w:t>
+              <w:t xml:space="preserve">This flag need not exist in the target machine but is defined </w:t>
+            </w:r>
+            <w:proofErr w:type="gramStart"/>
+            <w:r>
+              <w:rPr>
+                <w:rFonts w:cs="Courier New"/>
+              </w:rPr>
+              <w:t>in order to</w:t>
+            </w:r>
+            <w:proofErr w:type="gramEnd"/>
+            <w:r>
+              <w:rPr>
+                <w:rFonts w:cs="Courier New"/>
+              </w:rPr>
+              <w:t xml:space="preserve"> simplify the definitions of certain instructions.</w:t>
             </w:r>
           </w:p>
           <w:p>
@@ -11227,7 +11263,21 @@
               <w:rPr>
                 <w:rFonts w:cs="Courier New"/>
               </w:rPr>
-              <w:t>The values which this flag may take are: equal, less than, greater than, true, false</w:t>
+              <w:t xml:space="preserve">The values which this flag may take </w:t>
+            </w:r>
+            <w:proofErr w:type="gramStart"/>
+            <w:r>
+              <w:rPr>
+                <w:rFonts w:cs="Courier New"/>
+              </w:rPr>
+              <w:t>are:</w:t>
+            </w:r>
+            <w:proofErr w:type="gramEnd"/>
+            <w:r>
+              <w:rPr>
+                <w:rFonts w:cs="Courier New"/>
+              </w:rPr>
+              <w:t xml:space="preserve"> equal, less than, greater than, true, false</w:t>
             </w:r>
           </w:p>
           <w:p>
@@ -11398,7 +11448,21 @@
               <w:rPr>
                 <w:rFonts w:cs="Courier New"/>
               </w:rPr>
-              <w:t>Simple labels are encoded as two-byte unsigned integers although code generators may assume that their values are within a fairly small range.</w:t>
+              <w:t xml:space="preserve">Simple labels are encoded as two-byte unsigned integers although code generators may assume that their values are within a </w:t>
+            </w:r>
+            <w:proofErr w:type="gramStart"/>
+            <w:r>
+              <w:rPr>
+                <w:rFonts w:cs="Courier New"/>
+              </w:rPr>
+              <w:t>fairly small</w:t>
+            </w:r>
+            <w:proofErr w:type="gramEnd"/>
+            <w:r>
+              <w:rPr>
+                <w:rFonts w:cs="Courier New"/>
+              </w:rPr>
+              <w:t xml:space="preserve"> range.</w:t>
             </w:r>
           </w:p>
           <w:p>
@@ -15236,9 +15300,11 @@
             <w:tcW w:w="1701" w:type="dxa"/>
           </w:tcPr>
           <w:p>
+            <w:proofErr w:type="spellStart"/>
             <w:r>
               <w:t>i</w:t>
             </w:r>
+            <w:proofErr w:type="spellEnd"/>
           </w:p>
         </w:tc>
         <w:tc>
@@ -16118,8 +16184,13 @@
           </w:tcPr>
           <w:p>
             <w:r>
-              <w:t>Byte Byte</w:t>
-            </w:r>
+              <w:t xml:space="preserve">Byte </w:t>
+            </w:r>
+            <w:proofErr w:type="spellStart"/>
+            <w:r>
+              <w:t>Byte</w:t>
+            </w:r>
+            <w:proofErr w:type="spellEnd"/>
           </w:p>
         </w:tc>
       </w:tr>
@@ -16296,7 +16367,15 @@
           </w:tcPr>
           <w:p>
             <w:r>
-              <w:t>Load Operation( ADDx )</w:t>
+              <w:t xml:space="preserve">Load Operation( </w:t>
+            </w:r>
+            <w:proofErr w:type="spellStart"/>
+            <w:r>
+              <w:t>ADDx</w:t>
+            </w:r>
+            <w:proofErr w:type="spellEnd"/>
+            <w:r>
+              <w:t xml:space="preserve"> )</w:t>
             </w:r>
           </w:p>
         </w:tc>
@@ -16513,7 +16592,15 @@
           </w:tcPr>
           <w:p>
             <w:r>
-              <w:t>Load Double( ADDx )</w:t>
+              <w:t xml:space="preserve">Load Double( </w:t>
+            </w:r>
+            <w:proofErr w:type="spellStart"/>
+            <w:r>
+              <w:t>ADDx</w:t>
+            </w:r>
+            <w:proofErr w:type="spellEnd"/>
+            <w:r>
+              <w:t xml:space="preserve"> )</w:t>
             </w:r>
           </w:p>
         </w:tc>
@@ -16729,7 +16816,15 @@
           </w:tcPr>
           <w:p>
             <w:r>
-              <w:t>Load Operation( ANDx )</w:t>
+              <w:t xml:space="preserve">Load Operation( </w:t>
+            </w:r>
+            <w:proofErr w:type="spellStart"/>
+            <w:r>
+              <w:t>ANDx</w:t>
+            </w:r>
+            <w:proofErr w:type="spellEnd"/>
+            <w:r>
+              <w:t xml:space="preserve"> )</w:t>
             </w:r>
           </w:p>
         </w:tc>
@@ -17007,7 +17102,15 @@
           </w:tcPr>
           <w:p>
             <w:r>
-              <w:t>Load Operation( CONCx )</w:t>
+              <w:t xml:space="preserve">Load Operation( </w:t>
+            </w:r>
+            <w:proofErr w:type="spellStart"/>
+            <w:r>
+              <w:t>CONCx</w:t>
+            </w:r>
+            <w:proofErr w:type="spellEnd"/>
+            <w:r>
+              <w:t xml:space="preserve"> )</w:t>
             </w:r>
           </w:p>
         </w:tc>
@@ -17229,7 +17332,15 @@
           </w:tcPr>
           <w:p>
             <w:r>
-              <w:t>Load Operation( RDIVx )</w:t>
+              <w:t xml:space="preserve">Load Operation( </w:t>
+            </w:r>
+            <w:proofErr w:type="spellStart"/>
+            <w:r>
+              <w:t>RDIVx</w:t>
+            </w:r>
+            <w:proofErr w:type="spellEnd"/>
+            <w:r>
+              <w:t xml:space="preserve"> )</w:t>
             </w:r>
           </w:p>
         </w:tc>
@@ -17460,7 +17571,15 @@
           </w:tcPr>
           <w:p>
             <w:r>
-              <w:t>Load Operation( EXPx )</w:t>
+              <w:t xml:space="preserve">Load Operation( </w:t>
+            </w:r>
+            <w:proofErr w:type="spellStart"/>
+            <w:r>
+              <w:t>EXPx</w:t>
+            </w:r>
+            <w:proofErr w:type="spellEnd"/>
+            <w:r>
+              <w:t xml:space="preserve"> )</w:t>
             </w:r>
           </w:p>
         </w:tc>
@@ -17678,7 +17797,15 @@
           </w:tcPr>
           <w:p>
             <w:r>
-              <w:t>Load Operation( LSHx )</w:t>
+              <w:t xml:space="preserve">Load Operation( </w:t>
+            </w:r>
+            <w:proofErr w:type="spellStart"/>
+            <w:r>
+              <w:t>LSHx</w:t>
+            </w:r>
+            <w:proofErr w:type="spellEnd"/>
+            <w:r>
+              <w:t xml:space="preserve"> )</w:t>
             </w:r>
           </w:p>
         </w:tc>
@@ -17918,7 +18045,15 @@
           </w:tcPr>
           <w:p>
             <w:r>
-              <w:t>Load Operation( ABSx )</w:t>
+              <w:t xml:space="preserve">Load Operation( </w:t>
+            </w:r>
+            <w:proofErr w:type="spellStart"/>
+            <w:r>
+              <w:t>ABSx</w:t>
+            </w:r>
+            <w:proofErr w:type="spellEnd"/>
+            <w:r>
+              <w:t xml:space="preserve"> )</w:t>
             </w:r>
           </w:p>
         </w:tc>
@@ -18133,7 +18268,15 @@
           </w:tcPr>
           <w:p>
             <w:r>
-              <w:t>Load Operation( MULx )</w:t>
+              <w:t xml:space="preserve">Load Operation( </w:t>
+            </w:r>
+            <w:proofErr w:type="spellStart"/>
+            <w:r>
+              <w:t>MULx</w:t>
+            </w:r>
+            <w:proofErr w:type="spellEnd"/>
+            <w:r>
+              <w:t xml:space="preserve"> )</w:t>
             </w:r>
           </w:p>
         </w:tc>
@@ -18355,7 +18498,15 @@
           </w:tcPr>
           <w:p>
             <w:r>
-              <w:t>Load Operation(NEGx)</w:t>
+              <w:t>Load Operation(</w:t>
+            </w:r>
+            <w:proofErr w:type="spellStart"/>
+            <w:r>
+              <w:t>NEGx</w:t>
+            </w:r>
+            <w:proofErr w:type="spellEnd"/>
+            <w:r>
+              <w:t>)</w:t>
             </w:r>
           </w:p>
         </w:tc>
@@ -18552,7 +18703,15 @@
           </w:tcPr>
           <w:p>
             <w:r>
-              <w:t>Load Operation( NOTx )</w:t>
+              <w:t xml:space="preserve">Load Operation( </w:t>
+            </w:r>
+            <w:proofErr w:type="spellStart"/>
+            <w:r>
+              <w:t>NOTx</w:t>
+            </w:r>
+            <w:proofErr w:type="spellEnd"/>
+            <w:r>
+              <w:t xml:space="preserve"> )</w:t>
             </w:r>
           </w:p>
         </w:tc>
@@ -18722,7 +18881,15 @@
           </w:tcPr>
           <w:p>
             <w:r>
-              <w:t>Load Operation( ORx )</w:t>
+              <w:t xml:space="preserve">Load Operation( </w:t>
+            </w:r>
+            <w:proofErr w:type="spellStart"/>
+            <w:r>
+              <w:t>ORx</w:t>
+            </w:r>
+            <w:proofErr w:type="spellEnd"/>
+            <w:r>
+              <w:t xml:space="preserve"> )</w:t>
             </w:r>
           </w:p>
         </w:tc>
@@ -18938,7 +19105,15 @@
           </w:tcPr>
           <w:p>
             <w:r>
-              <w:t>Load Operation( DIVx )</w:t>
+              <w:t xml:space="preserve">Load Operation( </w:t>
+            </w:r>
+            <w:proofErr w:type="spellStart"/>
+            <w:r>
+              <w:t>DIVx</w:t>
+            </w:r>
+            <w:proofErr w:type="spellEnd"/>
+            <w:r>
+              <w:t xml:space="preserve"> )</w:t>
             </w:r>
           </w:p>
         </w:tc>
@@ -19156,7 +19331,15 @@
           </w:tcPr>
           <w:p>
             <w:r>
-              <w:t>Load Operation(REXPx)</w:t>
+              <w:t>Load Operation(</w:t>
+            </w:r>
+            <w:proofErr w:type="spellStart"/>
+            <w:r>
+              <w:t>REXPx</w:t>
+            </w:r>
+            <w:proofErr w:type="spellEnd"/>
+            <w:r>
+              <w:t>)</w:t>
             </w:r>
           </w:p>
         </w:tc>
@@ -19363,7 +19546,15 @@
           </w:tcPr>
           <w:p>
             <w:r>
-              <w:t>Load Operation( RSHx )</w:t>
+              <w:t xml:space="preserve">Load Operation( </w:t>
+            </w:r>
+            <w:proofErr w:type="spellStart"/>
+            <w:r>
+              <w:t>RSHx</w:t>
+            </w:r>
+            <w:proofErr w:type="spellEnd"/>
+            <w:r>
+              <w:t xml:space="preserve"> )</w:t>
             </w:r>
           </w:p>
         </w:tc>
@@ -19581,7 +19772,15 @@
           </w:tcPr>
           <w:p>
             <w:r>
-              <w:t>Load Operation( SUBx )</w:t>
+              <w:t xml:space="preserve">Load Operation( </w:t>
+            </w:r>
+            <w:proofErr w:type="spellStart"/>
+            <w:r>
+              <w:t>SUBx</w:t>
+            </w:r>
+            <w:proofErr w:type="spellEnd"/>
+            <w:r>
+              <w:t xml:space="preserve"> )</w:t>
             </w:r>
           </w:p>
         </w:tc>
@@ -19790,7 +19989,23 @@
           </w:tcPr>
           <w:p>
             <w:r>
-              <w:t>Load DoubleOp( SUBx)</w:t>
+              <w:t xml:space="preserve">Load </w:t>
+            </w:r>
+            <w:proofErr w:type="spellStart"/>
+            <w:r>
+              <w:t>DoubleOp</w:t>
+            </w:r>
+            <w:proofErr w:type="spellEnd"/>
+            <w:r>
+              <w:t xml:space="preserve">( </w:t>
+            </w:r>
+            <w:proofErr w:type="spellStart"/>
+            <w:r>
+              <w:t>SUBx</w:t>
+            </w:r>
+            <w:proofErr w:type="spellEnd"/>
+            <w:r>
+              <w:t>)</w:t>
             </w:r>
           </w:p>
         </w:tc>
@@ -19812,8 +20027,13 @@
             <w:gridSpan w:val="3"/>
           </w:tcPr>
           <w:p>
-            <w:r>
-              <w:t>Similar to Sub except generated code is for addresses</w:t>
+            <w:proofErr w:type="gramStart"/>
+            <w:r>
+              <w:t>Similar to</w:t>
+            </w:r>
+            <w:proofErr w:type="gramEnd"/>
+            <w:r>
+              <w:t xml:space="preserve"> Sub except generated code is for addresses</w:t>
             </w:r>
           </w:p>
         </w:tc>
@@ -19982,7 +20202,15 @@
           </w:tcPr>
           <w:p>
             <w:r>
-              <w:t>Load Operation( XORx )</w:t>
+              <w:t xml:space="preserve">Load Operation( </w:t>
+            </w:r>
+            <w:proofErr w:type="spellStart"/>
+            <w:r>
+              <w:t>XORx</w:t>
+            </w:r>
+            <w:proofErr w:type="spellEnd"/>
+            <w:r>
+              <w:t xml:space="preserve"> )</w:t>
             </w:r>
           </w:p>
         </w:tc>
@@ -21135,11 +21363,16 @@
             <w:r>
               <w:t xml:space="preserve">&lt;label&gt; must refer to a simple label which must be defined somewhere after the JG instruction, that is JG can only specify a forward jump (the object program may </w:t>
             </w:r>
+            <w:proofErr w:type="gramStart"/>
             <w:r>
               <w:t xml:space="preserve">actually </w:t>
             </w:r>
             <w:r>
-              <w:t>use a backward jump</w:t>
+              <w:t>use</w:t>
+            </w:r>
+            <w:proofErr w:type="gramEnd"/>
+            <w:r>
+              <w:t xml:space="preserve"> a backward jump</w:t>
             </w:r>
             <w:r>
               <w:t xml:space="preserve"> instruction</w:t>
@@ -23983,7 +24216,15 @@
           </w:tcPr>
           <w:p>
             <w:r>
-              <w:t>-&gt;Sw(J)</w:t>
+              <w:t>-&gt;</w:t>
+            </w:r>
+            <w:proofErr w:type="spellStart"/>
+            <w:r>
+              <w:t>Sw</w:t>
+            </w:r>
+            <w:proofErr w:type="spellEnd"/>
+            <w:r>
+              <w:t>(J)</w:t>
             </w:r>
           </w:p>
         </w:tc>
@@ -23994,8 +24235,13 @@
           </w:tcPr>
           <w:p>
             <w:r>
-              <w:t>Stack J; Switch-Jump Sw</w:t>
-            </w:r>
+              <w:t xml:space="preserve">Stack J; Switch-Jump </w:t>
+            </w:r>
+            <w:proofErr w:type="spellStart"/>
+            <w:r>
+              <w:t>Sw</w:t>
+            </w:r>
+            <w:proofErr w:type="spellEnd"/>
           </w:p>
         </w:tc>
       </w:tr>
@@ -24191,8 +24437,13 @@
             <w:tcW w:w="2552" w:type="dxa"/>
           </w:tcPr>
           <w:p>
-            <w:r>
-              <w:t>Sw(12):</w:t>
+            <w:proofErr w:type="spellStart"/>
+            <w:r>
+              <w:t>Sw</w:t>
+            </w:r>
+            <w:proofErr w:type="spellEnd"/>
+            <w:r>
+              <w:t>(12):</w:t>
             </w:r>
           </w:p>
         </w:tc>
@@ -24203,8 +24454,13 @@
           </w:tcPr>
           <w:p>
             <w:r>
-              <w:t>PUSHI 12; SLABEL Sw</w:t>
-            </w:r>
+              <w:t xml:space="preserve">PUSHI 12; SLABEL </w:t>
+            </w:r>
+            <w:proofErr w:type="spellStart"/>
+            <w:r>
+              <w:t>Sw</w:t>
+            </w:r>
+            <w:proofErr w:type="spellEnd"/>
           </w:p>
         </w:tc>
       </w:tr>
@@ -25570,7 +25826,15 @@
           </w:tcPr>
           <w:p>
             <w:r>
-              <w:t>Load Return ( Fn )</w:t>
+              <w:t xml:space="preserve">Load Return ( </w:t>
+            </w:r>
+            <w:proofErr w:type="spellStart"/>
+            <w:r>
+              <w:t>Fn</w:t>
+            </w:r>
+            <w:proofErr w:type="spellEnd"/>
+            <w:r>
+              <w:t xml:space="preserve"> )</w:t>
             </w:r>
           </w:p>
         </w:tc>
@@ -26831,8 +27095,21 @@
             <w:tcW w:w="2582" w:type="dxa"/>
           </w:tcPr>
           <w:p>
-            <w:r>
-              <w:t>EventTrap( TagC, Tag )</w:t>
+            <w:proofErr w:type="spellStart"/>
+            <w:r>
+              <w:t>EventTrap</w:t>
+            </w:r>
+            <w:proofErr w:type="spellEnd"/>
+            <w:r>
+              <w:t xml:space="preserve">( </w:t>
+            </w:r>
+            <w:proofErr w:type="spellStart"/>
+            <w:r>
+              <w:t>TagC</w:t>
+            </w:r>
+            <w:proofErr w:type="spellEnd"/>
+            <w:r>
+              <w:t>, Tag )</w:t>
             </w:r>
           </w:p>
         </w:tc>
@@ -26857,6 +27134,7 @@
             <w:r>
               <w:t xml:space="preserve">This instruction marks the start of an </w:t>
             </w:r>
+            <w:proofErr w:type="gramStart"/>
             <w:r>
               <w:rPr>
                 <w:u w:val="single"/>
@@ -26872,6 +27150,7 @@
               </w:rPr>
               <w:t>event</w:t>
             </w:r>
+            <w:proofErr w:type="gramEnd"/>
             <w:r>
               <w:t xml:space="preserve"> b</w:t>
             </w:r>
@@ -26987,12 +27266,14 @@
             <w:r>
               <w:t xml:space="preserve"> 9 </w:t>
             </w:r>
+            <w:proofErr w:type="gramStart"/>
             <w:r>
               <w:rPr>
                 <w:u w:val="single"/>
               </w:rPr>
               <w:t>start</w:t>
             </w:r>
+            <w:proofErr w:type="gramEnd"/>
             <w:r>
               <w:t xml:space="preserve">; </w:t>
             </w:r>
@@ -27300,7 +27581,15 @@
           </w:tcPr>
           <w:p>
             <w:r>
-              <w:t>SOS is compared to TOS and the condition-code is set appropriately. TOS and SOS are then removed from the stack.</w:t>
+              <w:t xml:space="preserve">SOS is compared to </w:t>
+            </w:r>
+            <w:proofErr w:type="gramStart"/>
+            <w:r>
+              <w:t>TOS</w:t>
+            </w:r>
+            <w:proofErr w:type="gramEnd"/>
+            <w:r>
+              <w:t xml:space="preserve"> and the condition-code is set appropriately. TOS and SOS are then removed from the stack.</w:t>
             </w:r>
           </w:p>
         </w:tc>
@@ -27529,7 +27818,15 @@
           </w:tcPr>
           <w:p>
             <w:r>
-              <w:t>The address of SOS is compared to the address of TOS and the condition-code is set appropriately. TOS and SOS are then removed from the stack.</w:t>
+              <w:t xml:space="preserve">The address of SOS is compared to the address of </w:t>
+            </w:r>
+            <w:proofErr w:type="gramStart"/>
+            <w:r>
+              <w:t>TOS</w:t>
+            </w:r>
+            <w:proofErr w:type="gramEnd"/>
+            <w:r>
+              <w:t xml:space="preserve"> and the condition-code is set appropriately. TOS and SOS are then removed from the stack.</w:t>
             </w:r>
           </w:p>
         </w:tc>
@@ -27624,12 +27921,14 @@
             <w:gridSpan w:val="2"/>
           </w:tcPr>
           <w:p>
+            <w:proofErr w:type="spellStart"/>
             <w:r>
               <w:rPr>
                 <w:u w:val="single"/>
               </w:rPr>
               <w:t>integername</w:t>
             </w:r>
+            <w:proofErr w:type="spellEnd"/>
             <w:r>
               <w:t xml:space="preserve"> M; </w:t>
             </w:r>
@@ -27776,7 +28075,15 @@
           </w:tcPr>
           <w:p>
             <w:r>
-              <w:t>SOS is compared to TOS and the condition-code is set appropriately. TOS and SOS are then removed from the stack.</w:t>
+              <w:t xml:space="preserve">SOS is compared to </w:t>
+            </w:r>
+            <w:proofErr w:type="gramStart"/>
+            <w:r>
+              <w:t>TOS</w:t>
+            </w:r>
+            <w:proofErr w:type="gramEnd"/>
+            <w:r>
+              <w:t xml:space="preserve"> and the condition-code is set appropriately. TOS and SOS are then removed from the stack.</w:t>
             </w:r>
           </w:p>
         </w:tc>
@@ -27884,7 +28191,19 @@
               <w:t>if</w:t>
             </w:r>
             <w:r>
-              <w:t xml:space="preserve"> S &lt; "123" </w:t>
+              <w:t xml:space="preserve"> </w:t>
+            </w:r>
+            <w:r>
+              <w:t xml:space="preserve">1 &lt;= </w:t>
+            </w:r>
+            <w:r>
+              <w:t xml:space="preserve">S &lt; </w:t>
+            </w:r>
+            <w:r>
+              <w:t>16</w:t>
+            </w:r>
+            <w:r>
+              <w:t xml:space="preserve"> </w:t>
             </w:r>
             <w:r>
               <w:rPr>
@@ -27905,7 +28224,33 @@
           </w:tcPr>
           <w:p>
             <w:r>
-              <w:t>PUSH S; PUSHS "123"; COMPARED; BGE 13</w:t>
+              <w:t>PUSH S; PUSH</w:t>
+            </w:r>
+            <w:r>
+              <w:t>I</w:t>
+            </w:r>
+            <w:r>
+              <w:t xml:space="preserve"> </w:t>
+            </w:r>
+            <w:r>
+              <w:t>1</w:t>
+            </w:r>
+            <w:r>
+              <w:t>; COMPARED; B</w:t>
+            </w:r>
+            <w:r>
+              <w:t>GT</w:t>
+            </w:r>
+            <w:r>
+              <w:t xml:space="preserve"> 13</w:t>
+            </w:r>
+            <w:r>
+              <w:t>;</w:t>
+            </w:r>
+          </w:p>
+          <w:p>
+            <w:r>
+              <w:t>PUSHI 16;COMPARE;BGT 13</w:t>
             </w:r>
           </w:p>
           <w:p>
@@ -27956,7 +28301,15 @@
     </w:p>
     <w:p>
       <w:r>
-        <w:t>The ICODE instruction, DEF, indicates the data-type, size and structure of a variable. When referencing the variable, the tag value is used.</w:t>
+        <w:t xml:space="preserve">The ICODE instruction, DEF, indicates the </w:t>
+      </w:r>
+      <w:proofErr w:type="gramStart"/>
+      <w:r>
+        <w:t>data-type</w:t>
+      </w:r>
+      <w:proofErr w:type="gramEnd"/>
+      <w:r>
+        <w:t>, size and structure of a variable. When referencing the variable, the tag value is used.</w:t>
       </w:r>
     </w:p>
     <w:tbl>
@@ -28019,7 +28372,15 @@
           </w:tcPr>
           <w:p>
             <w:r>
-              <w:t>Get Alias Value( ReadString )</w:t>
+              <w:t xml:space="preserve">Get Alias Value( </w:t>
+            </w:r>
+            <w:proofErr w:type="spellStart"/>
+            <w:r>
+              <w:t>ReadString</w:t>
+            </w:r>
+            <w:proofErr w:type="spellEnd"/>
+            <w:r>
+              <w:t xml:space="preserve"> )</w:t>
             </w:r>
           </w:p>
         </w:tc>
@@ -28235,12 +28596,14 @@
             <w:tcW w:w="2925" w:type="dxa"/>
           </w:tcPr>
           <w:p>
+            <w:proofErr w:type="spellStart"/>
             <w:r>
               <w:t>Alternate</w:t>
             </w:r>
             <w:r>
               <w:t>Next</w:t>
             </w:r>
+            <w:proofErr w:type="spellEnd"/>
           </w:p>
         </w:tc>
       </w:tr>
@@ -28349,12 +28712,14 @@
             <w:gridSpan w:val="3"/>
           </w:tcPr>
           <w:p>
+            <w:proofErr w:type="spellStart"/>
             <w:r>
               <w:rPr>
                 <w:u w:val="single"/>
               </w:rPr>
               <w:t>recordformat</w:t>
             </w:r>
+            <w:proofErr w:type="spellEnd"/>
             <w:r>
               <w:t xml:space="preserve"> F(</w:t>
             </w:r>
@@ -28524,9 +28889,11 @@
             <w:tcW w:w="2925" w:type="dxa"/>
           </w:tcPr>
           <w:p>
+            <w:proofErr w:type="spellStart"/>
             <w:r>
               <w:t>AlternateStart</w:t>
             </w:r>
+            <w:proofErr w:type="spellEnd"/>
           </w:p>
         </w:tc>
       </w:tr>
@@ -28623,12 +28990,14 @@
             <w:gridSpan w:val="3"/>
           </w:tcPr>
           <w:p>
+            <w:proofErr w:type="spellStart"/>
             <w:r>
               <w:rPr>
                 <w:u w:val="single"/>
               </w:rPr>
               <w:t>recordformat</w:t>
             </w:r>
+            <w:proofErr w:type="spellEnd"/>
             <w:r>
               <w:t xml:space="preserve"> F(</w:t>
             </w:r>
@@ -28804,9 +29173,11 @@
             <w:tcW w:w="2925" w:type="dxa"/>
           </w:tcPr>
           <w:p>
+            <w:proofErr w:type="spellStart"/>
             <w:r>
               <w:t>AlternateEnd</w:t>
             </w:r>
+            <w:proofErr w:type="spellEnd"/>
           </w:p>
         </w:tc>
       </w:tr>
@@ -28903,12 +29274,14 @@
             <w:gridSpan w:val="3"/>
           </w:tcPr>
           <w:p>
+            <w:proofErr w:type="spellStart"/>
             <w:r>
               <w:rPr>
                 <w:u w:val="single"/>
               </w:rPr>
               <w:t>recordformat</w:t>
             </w:r>
+            <w:proofErr w:type="spellEnd"/>
             <w:r>
               <w:t xml:space="preserve"> F(</w:t>
             </w:r>
@@ -29090,7 +29463,15 @@
           </w:tcPr>
           <w:p>
             <w:r>
-              <w:t>The value of TOS is noted as 'upper-bound' and the value of SOS is noted as 'lower-bound'. TOS and SOS are removed from the stack.</w:t>
+              <w:t>The value of TOS is noted as 'upper-bound</w:t>
+            </w:r>
+            <w:proofErr w:type="gramStart"/>
+            <w:r>
+              <w:t>'</w:t>
+            </w:r>
+            <w:proofErr w:type="gramEnd"/>
+            <w:r>
+              <w:t xml:space="preserve"> and the value of SOS is noted as 'lower-bound'. TOS and SOS are removed from the stack.</w:t>
             </w:r>
           </w:p>
         </w:tc>
@@ -29118,7 +29499,15 @@
           </w:p>
           <w:p>
             <w:r>
-              <w:t xml:space="preserve">This instruction is used as a preliminary to defining </w:t>
+              <w:t xml:space="preserve">This instruction is used as a preliminary to </w:t>
+            </w:r>
+            <w:proofErr w:type="gramStart"/>
+            <w:r>
+              <w:t>defining</w:t>
+            </w:r>
+            <w:proofErr w:type="gramEnd"/>
+            <w:r>
+              <w:t xml:space="preserve"> </w:t>
             </w:r>
             <w:r>
               <w:rPr>
@@ -29138,12 +29527,14 @@
             <w:r>
               <w:t xml:space="preserve">, </w:t>
             </w:r>
+            <w:proofErr w:type="spellStart"/>
             <w:r>
               <w:rPr>
                 <w:u w:val="single"/>
               </w:rPr>
               <w:t>const</w:t>
             </w:r>
+            <w:proofErr w:type="spellEnd"/>
             <w:r>
               <w:t xml:space="preserve"> and </w:t>
             </w:r>
@@ -29248,7 +29639,15 @@
               <w:t>switch</w:t>
             </w:r>
             <w:r>
-              <w:t xml:space="preserve"> Sw(-3:3)</w:t>
+              <w:t xml:space="preserve"> </w:t>
+            </w:r>
+            <w:proofErr w:type="spellStart"/>
+            <w:r>
+              <w:t>Sw</w:t>
+            </w:r>
+            <w:proofErr w:type="spellEnd"/>
+            <w:r>
+              <w:t>(-3:3)</w:t>
             </w:r>
           </w:p>
           <w:p/>
@@ -29344,7 +29743,31 @@
           </w:tcPr>
           <w:p>
             <w:r>
-              <w:t>Define Var( Tag, AsciiC, TagC, TagC, Tag )</w:t>
+              <w:t xml:space="preserve">Define Var( Tag, </w:t>
+            </w:r>
+            <w:proofErr w:type="spellStart"/>
+            <w:r>
+              <w:t>AsciiC</w:t>
+            </w:r>
+            <w:proofErr w:type="spellEnd"/>
+            <w:r>
+              <w:t xml:space="preserve">, </w:t>
+            </w:r>
+            <w:proofErr w:type="spellStart"/>
+            <w:r>
+              <w:t>TagC</w:t>
+            </w:r>
+            <w:proofErr w:type="spellEnd"/>
+            <w:r>
+              <w:t xml:space="preserve">, </w:t>
+            </w:r>
+            <w:proofErr w:type="spellStart"/>
+            <w:r>
+              <w:t>TagC</w:t>
+            </w:r>
+            <w:proofErr w:type="spellEnd"/>
+            <w:r>
+              <w:t>, Tag )</w:t>
             </w:r>
           </w:p>
         </w:tc>
@@ -29415,7 +29838,15 @@
           </w:p>
           <w:p>
             <w:r>
-              <w:t>Variable defined where T&gt;4 are invalid for any version of the IMP language</w:t>
+              <w:t xml:space="preserve">Variable defined where T&gt;4 </w:t>
+            </w:r>
+            <w:proofErr w:type="gramStart"/>
+            <w:r>
+              <w:t>are</w:t>
+            </w:r>
+            <w:proofErr w:type="gramEnd"/>
+            <w:r>
+              <w:t xml:space="preserve"> invalid for any version of the IMP language</w:t>
             </w:r>
           </w:p>
           <w:p>
@@ -29476,7 +29907,15 @@
           </w:p>
           <w:p>
             <w:r>
-              <w:t xml:space="preserve"> F = 2 : indirect {bytename}</w:t>
+              <w:t xml:space="preserve"> F = 2 : indirect {</w:t>
+            </w:r>
+            <w:proofErr w:type="spellStart"/>
+            <w:r>
+              <w:t>bytename</w:t>
+            </w:r>
+            <w:proofErr w:type="spellEnd"/>
+            <w:r>
+              <w:t>}</w:t>
             </w:r>
           </w:p>
           <w:p>
@@ -29486,8 +29925,13 @@
           </w:p>
           <w:p>
             <w:r>
-              <w:t xml:space="preserve"> F = 4 : recordformat</w:t>
-            </w:r>
+              <w:t xml:space="preserve"> F = 4 : </w:t>
+            </w:r>
+            <w:proofErr w:type="spellStart"/>
+            <w:r>
+              <w:t>recordformat</w:t>
+            </w:r>
+            <w:proofErr w:type="spellEnd"/>
           </w:p>
           <w:p>
             <w:r>
@@ -29526,17 +29970,41 @@
           </w:p>
           <w:p>
             <w:r>
-              <w:t xml:space="preserve"> F = 12 : array indirect {arrayname}</w:t>
-            </w:r>
-          </w:p>
-          <w:p>
-            <w:r>
-              <w:t xml:space="preserve"> F = 13 : indirect array {namearray}</w:t>
-            </w:r>
-          </w:p>
-          <w:p>
-            <w:r>
-              <w:t xml:space="preserve"> F = 14 : indirect array indirect {namearrayname}</w:t>
+              <w:t xml:space="preserve"> F = 12 : array indirect {</w:t>
+            </w:r>
+            <w:proofErr w:type="spellStart"/>
+            <w:r>
+              <w:t>arrayname</w:t>
+            </w:r>
+            <w:proofErr w:type="spellEnd"/>
+            <w:r>
+              <w:t>}</w:t>
+            </w:r>
+          </w:p>
+          <w:p>
+            <w:r>
+              <w:t xml:space="preserve"> F = 13 : indirect array {</w:t>
+            </w:r>
+            <w:proofErr w:type="spellStart"/>
+            <w:r>
+              <w:t>namearray</w:t>
+            </w:r>
+            <w:proofErr w:type="spellEnd"/>
+            <w:r>
+              <w:t>}</w:t>
+            </w:r>
+          </w:p>
+          <w:p>
+            <w:r>
+              <w:t xml:space="preserve"> F = 14 : indirect array indirect {</w:t>
+            </w:r>
+            <w:proofErr w:type="spellStart"/>
+            <w:r>
+              <w:t>namearrayname</w:t>
+            </w:r>
+            <w:proofErr w:type="spellEnd"/>
+            <w:r>
+              <w:t>}</w:t>
             </w:r>
           </w:p>
           <w:p>
@@ -29745,7 +30213,15 @@
           <w:p/>
           <w:p>
             <w:r>
-              <w:t xml:space="preserve"> If T is RECORD &lt;b&gt; gives the tag of the corresponding recordformat.</w:t>
+              <w:t xml:space="preserve"> If T is RECORD &lt;b&gt; gives the tag of the corresponding </w:t>
+            </w:r>
+            <w:proofErr w:type="spellStart"/>
+            <w:r>
+              <w:t>recordformat</w:t>
+            </w:r>
+            <w:proofErr w:type="spellEnd"/>
+            <w:r>
+              <w:t>.</w:t>
             </w:r>
           </w:p>
           <w:p/>
@@ -29917,7 +30393,15 @@
           <w:p/>
           <w:p>
             <w:r>
-              <w:t>The tag values used within a recordformat definition must all be zero; the fields of a record are selected by their position in the format, numbered starting from one.</w:t>
+              <w:t xml:space="preserve">The tag values used within a </w:t>
+            </w:r>
+            <w:proofErr w:type="spellStart"/>
+            <w:r>
+              <w:t>recordformat</w:t>
+            </w:r>
+            <w:proofErr w:type="spellEnd"/>
+            <w:r>
+              <w:t xml:space="preserve"> definition must all be zero; the fields of a record are selected by their position in the format, numbered starting from one.</w:t>
             </w:r>
           </w:p>
           <w:p/>
@@ -32483,7 +32967,15 @@
           </w:tcPr>
           <w:p>
             <w:r>
-              <w:t>Dimension( TagC, Tag )</w:t>
+              <w:t xml:space="preserve">Dimension( </w:t>
+            </w:r>
+            <w:proofErr w:type="spellStart"/>
+            <w:r>
+              <w:t>TagC</w:t>
+            </w:r>
+            <w:proofErr w:type="spellEnd"/>
+            <w:r>
+              <w:t>, Tag )</w:t>
             </w:r>
           </w:p>
         </w:tc>
@@ -32614,12 +33106,14 @@
             <w:gridSpan w:val="2"/>
           </w:tcPr>
           <w:p>
+            <w:proofErr w:type="spellStart"/>
             <w:r>
               <w:rPr>
                 <w:u w:val="single"/>
               </w:rPr>
               <w:t>integerarray</w:t>
             </w:r>
+            <w:proofErr w:type="spellEnd"/>
             <w:r>
               <w:t xml:space="preserve"> A, B, C(1:2, Low:4)</w:t>
             </w:r>
@@ -32753,7 +33247,15 @@
           </w:tcPr>
           <w:p>
             <w:r>
-              <w:t>This instruction marks the end of a list of tag definitions corresponding to either a parameter list or a recordformat definition. List flag is cleared</w:t>
+              <w:t xml:space="preserve">This instruction marks the end of a list of tag definitions corresponding to either a parameter list or a </w:t>
+            </w:r>
+            <w:proofErr w:type="spellStart"/>
+            <w:r>
+              <w:t>recordformat</w:t>
+            </w:r>
+            <w:proofErr w:type="spellEnd"/>
+            <w:r>
+              <w:t xml:space="preserve"> definition. List flag is cleared</w:t>
             </w:r>
             <w:r>
               <w:t>,</w:t>
@@ -32764,7 +33266,15 @@
           </w:p>
           <w:p>
             <w:r>
-              <w:t>If the tag list is associated with a procedure spec or a recordformat this instruction also marks the 'end' of the associated 'block'.</w:t>
+              <w:t xml:space="preserve">If the tag list is associated with a procedure spec or a </w:t>
+            </w:r>
+            <w:proofErr w:type="spellStart"/>
+            <w:r>
+              <w:t>recordformat</w:t>
+            </w:r>
+            <w:proofErr w:type="spellEnd"/>
+            <w:r>
+              <w:t xml:space="preserve"> this instruction also marks the 'end' of the associated 'block'.</w:t>
             </w:r>
           </w:p>
         </w:tc>
@@ -32938,12 +33448,14 @@
             <w:gridSpan w:val="2"/>
           </w:tcPr>
           <w:p>
+            <w:proofErr w:type="spellStart"/>
             <w:r>
               <w:rPr>
                 <w:u w:val="single"/>
               </w:rPr>
               <w:t>recordformat</w:t>
             </w:r>
+            <w:proofErr w:type="spellEnd"/>
             <w:r>
               <w:t xml:space="preserve"> F(</w:t>
             </w:r>
@@ -33117,7 +33629,39 @@
           </w:tcPr>
           <w:p>
             <w:r>
-              <w:t>&lt;n&gt; copies of the init-value are added to the list of values associated with the init-variable. The init-value is either the default value (unassigned) if the stack is empty, the value of TOS (possibly converted to real) if TOS is a constant, or the address of TOS if TOS is a variable. The init-variable is the last static object to have been defined using Define.</w:t>
+              <w:t xml:space="preserve">&lt;n&gt; copies of the </w:t>
+            </w:r>
+            <w:proofErr w:type="spellStart"/>
+            <w:r>
+              <w:t>init</w:t>
+            </w:r>
+            <w:proofErr w:type="spellEnd"/>
+            <w:r>
+              <w:t xml:space="preserve">-value are added to the list of values associated with the </w:t>
+            </w:r>
+            <w:proofErr w:type="spellStart"/>
+            <w:r>
+              <w:t>init</w:t>
+            </w:r>
+            <w:proofErr w:type="spellEnd"/>
+            <w:r>
+              <w:t xml:space="preserve">-variable. The </w:t>
+            </w:r>
+            <w:proofErr w:type="spellStart"/>
+            <w:r>
+              <w:t>init</w:t>
+            </w:r>
+            <w:proofErr w:type="spellEnd"/>
+            <w:r>
+              <w:t xml:space="preserve">-value is either the default value (unassigned) if the stack is empty, the value of TOS (possibly converted to real) if TOS is a constant, or the address of TOS if TOS is a variable. The </w:t>
+            </w:r>
+            <w:proofErr w:type="spellStart"/>
+            <w:r>
+              <w:t>init</w:t>
+            </w:r>
+            <w:proofErr w:type="spellEnd"/>
+            <w:r>
+              <w:t>-variable is the last static object to have been defined using Define.</w:t>
             </w:r>
           </w:p>
         </w:tc>
@@ -33170,7 +33714,15 @@
               </w:numPr>
             </w:pPr>
             <w:r>
-              <w:t>TOS, if it exists, is not of the same type as the init-variable.</w:t>
+              <w:t xml:space="preserve">TOS, if it exists, is not of the same type as the </w:t>
+            </w:r>
+            <w:proofErr w:type="spellStart"/>
+            <w:r>
+              <w:t>init</w:t>
+            </w:r>
+            <w:proofErr w:type="spellEnd"/>
+            <w:r>
+              <w:t>-variable.</w:t>
             </w:r>
           </w:p>
         </w:tc>
@@ -33445,7 +33997,15 @@
               </w:numPr>
             </w:pPr>
             <w:r>
-              <w:t>&lt;tag&gt; is not a recordformat.</w:t>
+              <w:t xml:space="preserve">&lt;tag&gt; is not a </w:t>
+            </w:r>
+            <w:proofErr w:type="spellStart"/>
+            <w:r>
+              <w:t>recordformat</w:t>
+            </w:r>
+            <w:proofErr w:type="spellEnd"/>
+            <w:r>
+              <w:t>.</w:t>
             </w:r>
           </w:p>
           <w:p>
@@ -33554,9 +34114,11 @@
             <w:tcW w:w="2582" w:type="dxa"/>
           </w:tcPr>
           <w:p>
+            <w:proofErr w:type="spellStart"/>
             <w:r>
               <w:t>StartParams</w:t>
             </w:r>
+            <w:proofErr w:type="spellEnd"/>
           </w:p>
         </w:tc>
       </w:tr>
@@ -33601,7 +34163,15 @@
           </w:tcPr>
           <w:p>
             <w:r>
-              <w:t>This instruction must always follow the definition of a procedure or recordformat tag. There must be a matching 'Finish' before the end of the block.</w:t>
+              <w:t xml:space="preserve">This instruction must always follow the definition of a procedure or </w:t>
+            </w:r>
+            <w:proofErr w:type="spellStart"/>
+            <w:r>
+              <w:t>recordformat</w:t>
+            </w:r>
+            <w:proofErr w:type="spellEnd"/>
+            <w:r>
+              <w:t xml:space="preserve"> tag. There must be a matching 'Finish' before the end of the block.</w:t>
             </w:r>
           </w:p>
         </w:tc>
@@ -33643,7 +34213,15 @@
               </w:numPr>
             </w:pPr>
             <w:r>
-              <w:t>The last instruction was not a 'Define' which introduced a procedure or recordformat.</w:t>
+              <w:t xml:space="preserve">The last instruction was not a 'Define' which introduced a procedure or </w:t>
+            </w:r>
+            <w:proofErr w:type="spellStart"/>
+            <w:r>
+              <w:t>recordformat</w:t>
+            </w:r>
+            <w:proofErr w:type="spellEnd"/>
+            <w:r>
+              <w:t>.</w:t>
             </w:r>
           </w:p>
         </w:tc>
@@ -34010,7 +34588,15 @@
           </w:tcPr>
           <w:p>
             <w:r>
-              <w:t>‘i’</w:t>
+              <w:t>‘</w:t>
+            </w:r>
+            <w:proofErr w:type="spellStart"/>
+            <w:r>
+              <w:t>i</w:t>
+            </w:r>
+            <w:proofErr w:type="spellEnd"/>
+            <w:r>
+              <w:t>’</w:t>
             </w:r>
           </w:p>
         </w:tc>
@@ -34407,7 +34993,23 @@
           </w:tcPr>
           <w:p>
             <w:r>
-              <w:t>Load Const( ReadInteger )</w:t>
+              <w:t xml:space="preserve">Load </w:t>
+            </w:r>
+            <w:proofErr w:type="spellStart"/>
+            <w:r>
+              <w:t>Const</w:t>
+            </w:r>
+            <w:proofErr w:type="spellEnd"/>
+            <w:r>
+              <w:t xml:space="preserve">( </w:t>
+            </w:r>
+            <w:proofErr w:type="spellStart"/>
+            <w:r>
+              <w:t>ReadInteger</w:t>
+            </w:r>
+            <w:proofErr w:type="spellEnd"/>
+            <w:r>
+              <w:t xml:space="preserve"> )</w:t>
             </w:r>
           </w:p>
         </w:tc>
@@ -34453,7 +35055,15 @@
           </w:tcPr>
           <w:p>
             <w:r>
-              <w:t>Load integer constant (calls Push Const)</w:t>
+              <w:t xml:space="preserve">Load integer constant (calls Push </w:t>
+            </w:r>
+            <w:proofErr w:type="spellStart"/>
+            <w:r>
+              <w:t>Const</w:t>
+            </w:r>
+            <w:proofErr w:type="spellEnd"/>
+            <w:r>
+              <w:t>)</w:t>
             </w:r>
           </w:p>
           <w:p>
@@ -34586,7 +35196,15 @@
           </w:tcPr>
           <w:p>
             <w:r>
-              <w:t>Input Real Value( ReadReal )</w:t>
+              <w:t xml:space="preserve">Input Real Value( </w:t>
+            </w:r>
+            <w:proofErr w:type="spellStart"/>
+            <w:r>
+              <w:t>ReadReal</w:t>
+            </w:r>
+            <w:proofErr w:type="spellEnd"/>
+            <w:r>
+              <w:t xml:space="preserve"> )</w:t>
             </w:r>
           </w:p>
         </w:tc>
@@ -34776,7 +35394,15 @@
           </w:tcPr>
           <w:p>
             <w:r>
-              <w:t>Input String Value( ReadString )</w:t>
+              <w:t xml:space="preserve">Input String Value( </w:t>
+            </w:r>
+            <w:proofErr w:type="spellStart"/>
+            <w:r>
+              <w:t>ReadString</w:t>
+            </w:r>
+            <w:proofErr w:type="spellEnd"/>
+            <w:r>
+              <w:t xml:space="preserve"> )</w:t>
             </w:r>
           </w:p>
         </w:tc>
@@ -35108,8 +35734,13 @@
             <w:tcW w:w="2582" w:type="dxa"/>
           </w:tcPr>
           <w:p>
-            <w:r>
-              <w:t>SelectField( Tag )</w:t>
+            <w:proofErr w:type="spellStart"/>
+            <w:r>
+              <w:t>SelectField</w:t>
+            </w:r>
+            <w:proofErr w:type="spellEnd"/>
+            <w:r>
+              <w:t>( Tag )</w:t>
             </w:r>
           </w:p>
         </w:tc>
@@ -35132,7 +35763,15 @@
           </w:tcPr>
           <w:p>
             <w:r>
-              <w:t>TOS is replaced by the &lt;n&gt;'th item in the format of TOS. Fields within records are numbered from 1; alternative markers have no effect on the numbering.</w:t>
+              <w:t>TOS is replaced by the &lt;n&gt;'</w:t>
+            </w:r>
+            <w:proofErr w:type="spellStart"/>
+            <w:r>
+              <w:t>th</w:t>
+            </w:r>
+            <w:proofErr w:type="spellEnd"/>
+            <w:r>
+              <w:t xml:space="preserve"> item in the format of TOS. Fields within records are numbered from 1; alternative markers have no effect on the numbering.</w:t>
             </w:r>
           </w:p>
         </w:tc>
@@ -35231,12 +35870,14 @@
             <w:gridSpan w:val="2"/>
           </w:tcPr>
           <w:p>
+            <w:proofErr w:type="spellStart"/>
             <w:r>
               <w:rPr>
                 <w:u w:val="single"/>
               </w:rPr>
               <w:t>recordformat</w:t>
             </w:r>
+            <w:proofErr w:type="spellEnd"/>
             <w:r>
               <w:t xml:space="preserve"> F(</w:t>
             </w:r>
@@ -35453,11 +36094,32 @@
             <w:r>
               <w:t xml:space="preserve"> </w:t>
             </w:r>
-            <w:r>
-              <w:t xml:space="preserve">represent the major, minor version of the iCode format respectively. They </w:t>
-            </w:r>
-            <w:r>
-              <w:t xml:space="preserve">direct the pass2 stage to accept different iCode versions </w:t>
+            <w:proofErr w:type="gramStart"/>
+            <w:r>
+              <w:t>represent</w:t>
+            </w:r>
+            <w:proofErr w:type="gramEnd"/>
+            <w:r>
+              <w:t xml:space="preserve"> the major, minor version of the </w:t>
+            </w:r>
+            <w:proofErr w:type="spellStart"/>
+            <w:r>
+              <w:t>iCode</w:t>
+            </w:r>
+            <w:proofErr w:type="spellEnd"/>
+            <w:r>
+              <w:t xml:space="preserve"> format respectively. They </w:t>
+            </w:r>
+            <w:r>
+              <w:t xml:space="preserve">direct the pass2 stage to accept different </w:t>
+            </w:r>
+            <w:proofErr w:type="spellStart"/>
+            <w:r>
+              <w:t>iCode</w:t>
+            </w:r>
+            <w:proofErr w:type="spellEnd"/>
+            <w:r>
+              <w:t xml:space="preserve"> versions </w:t>
             </w:r>
             <w:r>
               <w:t>in an implementation-specific manner.</w:t>
@@ -35595,7 +36257,15 @@
           </w:tcPr>
           <w:p>
             <w:r>
-              <w:t>Set Control( ReadTag )</w:t>
+              <w:t xml:space="preserve">Set Control( </w:t>
+            </w:r>
+            <w:proofErr w:type="spellStart"/>
+            <w:r>
+              <w:t>ReadTag</w:t>
+            </w:r>
+            <w:proofErr w:type="spellEnd"/>
+            <w:r>
+              <w:t xml:space="preserve"> )</w:t>
             </w:r>
           </w:p>
         </w:tc>
@@ -35618,7 +36288,15 @@
           </w:tcPr>
           <w:p>
             <w:r>
-              <w:t>The value &lt;n&gt; is of the form p&lt;&lt;14+q. The value q is to be used by the p'th pass of the compiler in an implementation-specific manner.</w:t>
+              <w:t xml:space="preserve">The value &lt;n&gt; is of the form p&lt;&lt;14+q. The value q is to be used by the </w:t>
+            </w:r>
+            <w:proofErr w:type="spellStart"/>
+            <w:r>
+              <w:t>p'th</w:t>
+            </w:r>
+            <w:proofErr w:type="spellEnd"/>
+            <w:r>
+              <w:t xml:space="preserve"> pass of the compiler in an implementation-specific manner.</w:t>
             </w:r>
           </w:p>
         </w:tc>
@@ -35744,7 +36422,15 @@
           </w:tcPr>
           <w:p>
             <w:r>
-              <w:t>Set Diagnose( ReadTag )</w:t>
+              <w:t xml:space="preserve">Set Diagnose( </w:t>
+            </w:r>
+            <w:proofErr w:type="spellStart"/>
+            <w:r>
+              <w:t>ReadTag</w:t>
+            </w:r>
+            <w:proofErr w:type="spellEnd"/>
+            <w:r>
+              <w:t xml:space="preserve"> )</w:t>
             </w:r>
           </w:p>
         </w:tc>
@@ -35767,7 +36453,15 @@
           </w:tcPr>
           <w:p>
             <w:r>
-              <w:t>The value &lt;n&gt; is of the form p&lt;&lt;14+q. The value q is to be used by the p'th pass of the compiler in an implementation-specific manner.</w:t>
+              <w:t xml:space="preserve">The value &lt;n&gt; is of the form p&lt;&lt;14+q. The value q is to be used by the </w:t>
+            </w:r>
+            <w:proofErr w:type="spellStart"/>
+            <w:r>
+              <w:t>p'th</w:t>
+            </w:r>
+            <w:proofErr w:type="spellEnd"/>
+            <w:r>
+              <w:t xml:space="preserve"> pass of the compiler in an implementation-specific manner.</w:t>
             </w:r>
           </w:p>
         </w:tc>
@@ -37547,7 +38241,15 @@
           </w:tcPr>
           <w:p>
             <w:r>
-              <w:t>P = Addr(Q)</w:t>
+              <w:t xml:space="preserve">P = </w:t>
+            </w:r>
+            <w:proofErr w:type="spellStart"/>
+            <w:r>
+              <w:t>Addr</w:t>
+            </w:r>
+            <w:proofErr w:type="spellEnd"/>
+            <w:r>
+              <w:t>(Q)</w:t>
             </w:r>
           </w:p>
         </w:tc>
@@ -37650,7 +38352,15 @@
           </w:tcPr>
           <w:p>
             <w:r>
-              <w:t>The address of SOS is adjusted forwards or backwards by TOS items of the same size as SOS. This may be thought of as an array accessing instruction where SOS defines the zero'th element.</w:t>
+              <w:t xml:space="preserve">The address of SOS is adjusted forwards or backwards by TOS items of the same size as SOS. This may be thought of as an array accessing instruction where SOS defines the </w:t>
+            </w:r>
+            <w:proofErr w:type="spellStart"/>
+            <w:r>
+              <w:t>zero'th</w:t>
+            </w:r>
+            <w:proofErr w:type="spellEnd"/>
+            <w:r>
+              <w:t xml:space="preserve"> element.</w:t>
             </w:r>
           </w:p>
         </w:tc>
@@ -37996,7 +38706,15 @@
           </w:tcPr>
           <w:p>
             <w:r>
-              <w:t>SOS is compared to TOS and the condition-code is set appropriately. SOS is then</w:t>
+              <w:t xml:space="preserve">SOS is compared to </w:t>
+            </w:r>
+            <w:proofErr w:type="gramStart"/>
+            <w:r>
+              <w:t>TOS</w:t>
+            </w:r>
+            <w:proofErr w:type="gramEnd"/>
+            <w:r>
+              <w:t xml:space="preserve"> and the condition-code is set appropriately. SOS is then</w:t>
             </w:r>
             <w:r>
               <w:t xml:space="preserve"> </w:t>
@@ -38223,7 +38941,15 @@
           </w:tcPr>
           <w:p>
             <w:r>
-              <w:t>SOS is compared against TOS with the values being interpreted as unsigned values. The condition-code is set accordingly and TOS and SOS are removed from the stack.</w:t>
+              <w:t xml:space="preserve">SOS is compared against TOS with the values being interpreted as unsigned values. The condition-code is set </w:t>
+            </w:r>
+            <w:proofErr w:type="gramStart"/>
+            <w:r>
+              <w:t>accordingly</w:t>
+            </w:r>
+            <w:proofErr w:type="gramEnd"/>
+            <w:r>
+              <w:t xml:space="preserve"> and TOS and SOS are removed from the stack.</w:t>
             </w:r>
           </w:p>
         </w:tc>
@@ -38344,7 +39070,15 @@
           </w:tcPr>
           <w:p>
             <w:r>
-              <w:t>Stack U1; Stack U2; Compare-Unsigned-Values; Bge 31</w:t>
+              <w:t xml:space="preserve">Stack U1; Stack U2; Compare-Unsigned-Values; </w:t>
+            </w:r>
+            <w:proofErr w:type="spellStart"/>
+            <w:r>
+              <w:t>Bge</w:t>
+            </w:r>
+            <w:proofErr w:type="spellEnd"/>
+            <w:r>
+              <w:t xml:space="preserve"> 31</w:t>
             </w:r>
           </w:p>
           <w:p>
@@ -38686,7 +39420,15 @@
           </w:tcPr>
           <w:p>
             <w:r>
-              <w:t>Var x:1..10; ...... x := i;</w:t>
+              <w:t xml:space="preserve">Var x:1..10; ...... x := </w:t>
+            </w:r>
+            <w:proofErr w:type="spellStart"/>
+            <w:r>
+              <w:t>i</w:t>
+            </w:r>
+            <w:proofErr w:type="spellEnd"/>
+            <w:r>
+              <w:t>;</w:t>
             </w:r>
           </w:p>
         </w:tc>
@@ -38712,7 +39454,15 @@
           </w:p>
           <w:p>
             <w:r>
-              <w:t>Stack x; Stack i; Test-Range 99; Assign-Value</w:t>
+              <w:t xml:space="preserve">Stack x; Stack </w:t>
+            </w:r>
+            <w:proofErr w:type="spellStart"/>
+            <w:r>
+              <w:t>i</w:t>
+            </w:r>
+            <w:proofErr w:type="spellEnd"/>
+            <w:r>
+              <w:t>; Test-Range 99; Assign-Value</w:t>
             </w:r>
           </w:p>
         </w:tc>
@@ -39054,8 +39804,13 @@
           </w:tcPr>
           <w:p>
             <w:r>
-              <w:t>a = b + c++</w:t>
-            </w:r>
+              <w:t xml:space="preserve">a = b + </w:t>
+            </w:r>
+            <w:proofErr w:type="spellStart"/>
+            <w:r>
+              <w:t>c++</w:t>
+            </w:r>
+            <w:proofErr w:type="spellEnd"/>
           </w:p>
         </w:tc>
         <w:tc>
@@ -39121,9 +39876,14 @@
             </w:pPr>
             <w:bookmarkStart w:id="106" w:name="_Toc193032402"/>
             <w:r>
-              <w:t>Eval-Addr</w:t>
+              <w:t>Eval-</w:t>
+            </w:r>
+            <w:proofErr w:type="spellStart"/>
+            <w:r>
+              <w:t>Addr</w:t>
             </w:r>
             <w:bookmarkEnd w:id="106"/>
+            <w:proofErr w:type="spellEnd"/>
           </w:p>
         </w:tc>
         <w:tc>
@@ -39255,7 +40015,15 @@
           </w:tcPr>
           <w:p>
             <w:r>
-              <w:t>Stack p; Eval-Addr; Stack p; Duplicate</w:t>
+              <w:t>Stack p; Eval-</w:t>
+            </w:r>
+            <w:proofErr w:type="spellStart"/>
+            <w:r>
+              <w:t>Addr</w:t>
+            </w:r>
+            <w:proofErr w:type="spellEnd"/>
+            <w:r>
+              <w:t>; Stack p; Duplicate</w:t>
             </w:r>
           </w:p>
           <w:p>
@@ -39657,13 +40425,29 @@
           </w:tcPr>
           <w:p>
             <w:r>
-              <w:t xml:space="preserve">The type of the init-variable (see Init) </w:t>
+              <w:t xml:space="preserve">The type of the </w:t>
+            </w:r>
+            <w:proofErr w:type="spellStart"/>
+            <w:r>
+              <w:t>init</w:t>
+            </w:r>
+            <w:proofErr w:type="spellEnd"/>
+            <w:r>
+              <w:t xml:space="preserve">-variable (see Init) </w:t>
             </w:r>
             <w:r>
               <w:t>is</w:t>
             </w:r>
             <w:r>
-              <w:t xml:space="preserve"> &lt;n&gt; for the purposes of subsequent 'Init' instructions. &lt;n&gt; encodes the type as in the type field of 'Define'.</w:t>
+              <w:t xml:space="preserve"> &lt;n&gt; for the purposes of subsequent 'Init' instructions. &lt;n&gt; encodes the type as in the </w:t>
+            </w:r>
+            <w:proofErr w:type="gramStart"/>
+            <w:r>
+              <w:t>type</w:t>
+            </w:r>
+            <w:proofErr w:type="gramEnd"/>
+            <w:r>
+              <w:t xml:space="preserve"> field of 'Define'.</w:t>
             </w:r>
           </w:p>
         </w:tc>
@@ -39965,10 +40749,12 @@
               <w:pStyle w:val="Heading3"/>
             </w:pPr>
             <w:bookmarkStart w:id="111" w:name="_Toc193032407"/>
+            <w:proofErr w:type="spellStart"/>
             <w:r>
               <w:t>Intpt</w:t>
             </w:r>
             <w:bookmarkEnd w:id="111"/>
+            <w:proofErr w:type="spellEnd"/>
           </w:p>
         </w:tc>
         <w:tc>
@@ -40003,7 +40789,15 @@
           </w:tcPr>
           <w:p>
             <w:r>
-              <w:t>TOS is replaced by Intpt(TOS), that is, the integer part of TOS. The type of the new TOS is integer.</w:t>
+              <w:t xml:space="preserve">TOS is replaced by </w:t>
+            </w:r>
+            <w:proofErr w:type="spellStart"/>
+            <w:r>
+              <w:t>Intpt</w:t>
+            </w:r>
+            <w:proofErr w:type="spellEnd"/>
+            <w:r>
+              <w:t>(TOS), that is, the integer part of TOS. The type of the new TOS is integer.</w:t>
             </w:r>
           </w:p>
         </w:tc>
@@ -40091,7 +40885,15 @@
           </w:tcPr>
           <w:p>
             <w:r>
-              <w:t>I = Intpt(R-S)</w:t>
+              <w:t xml:space="preserve">I = </w:t>
+            </w:r>
+            <w:proofErr w:type="spellStart"/>
+            <w:r>
+              <w:t>Intpt</w:t>
+            </w:r>
+            <w:proofErr w:type="spellEnd"/>
+            <w:r>
+              <w:t>(R-S)</w:t>
             </w:r>
           </w:p>
         </w:tc>
@@ -40106,9 +40908,11 @@
             </w:r>
           </w:p>
           <w:p>
+            <w:proofErr w:type="spellStart"/>
             <w:r>
               <w:t>Intpt</w:t>
             </w:r>
+            <w:proofErr w:type="spellEnd"/>
           </w:p>
           <w:p>
             <w:r>
@@ -40432,8 +41236,13 @@
             <w:tcW w:w="2552" w:type="dxa"/>
           </w:tcPr>
           <w:p>
-            <w:r>
-              <w:t>SetA := [];</w:t>
+            <w:proofErr w:type="spellStart"/>
+            <w:r>
+              <w:t>SetA</w:t>
+            </w:r>
+            <w:proofErr w:type="spellEnd"/>
+            <w:r>
+              <w:t xml:space="preserve"> := [];</w:t>
             </w:r>
           </w:p>
         </w:tc>
@@ -40444,7 +41253,15 @@
           </w:tcPr>
           <w:p>
             <w:r>
-              <w:t>Stack SetA; Null-Set; Assign-Value</w:t>
+              <w:t xml:space="preserve">Stack </w:t>
+            </w:r>
+            <w:proofErr w:type="spellStart"/>
+            <w:r>
+              <w:t>SetA</w:t>
+            </w:r>
+            <w:proofErr w:type="spellEnd"/>
+            <w:r>
+              <w:t>; Null-Set; Assign-Value</w:t>
             </w:r>
           </w:p>
         </w:tc>
@@ -40724,7 +41541,15 @@
               <w:t>T</w:t>
             </w:r>
             <w:r>
-              <w:t>he value of &lt;n&gt; is encoded in the same way as the type information, &lt;a&gt;, in the Define instruction.</w:t>
+              <w:t xml:space="preserve">he value of &lt;n&gt; is encoded in the same way as the </w:t>
+            </w:r>
+            <w:proofErr w:type="gramStart"/>
+            <w:r>
+              <w:t>type</w:t>
+            </w:r>
+            <w:proofErr w:type="gramEnd"/>
+            <w:r>
+              <w:t xml:space="preserve"> information, &lt;a&gt;, in the Define instruction.</w:t>
             </w:r>
           </w:p>
         </w:tc>
@@ -41201,8 +42026,13 @@
             <w:tcW w:w="2552" w:type="dxa"/>
           </w:tcPr>
           <w:p>
-            <w:r>
-              <w:t>i := Round(r+0.1);</w:t>
+            <w:proofErr w:type="spellStart"/>
+            <w:r>
+              <w:t>i</w:t>
+            </w:r>
+            <w:proofErr w:type="spellEnd"/>
+            <w:r>
+              <w:t xml:space="preserve"> := Round(r+0.1);</w:t>
             </w:r>
           </w:p>
         </w:tc>
@@ -41213,7 +42043,15 @@
           </w:tcPr>
           <w:p>
             <w:r>
-              <w:t>Stack i; Stack r; Real &lt;0.1&gt;; Add</w:t>
+              <w:t xml:space="preserve">Stack </w:t>
+            </w:r>
+            <w:proofErr w:type="spellStart"/>
+            <w:r>
+              <w:t>i</w:t>
+            </w:r>
+            <w:proofErr w:type="spellEnd"/>
+            <w:r>
+              <w:t>; Stack r; Real &lt;0.1&gt;; Add</w:t>
             </w:r>
           </w:p>
           <w:p>
@@ -41383,7 +42221,15 @@
           </w:tcPr>
           <w:p>
             <w:r>
-              <w:t>P = Sizeof(R)</w:t>
+              <w:t xml:space="preserve">P = </w:t>
+            </w:r>
+            <w:proofErr w:type="spellStart"/>
+            <w:r>
+              <w:t>Sizeof</w:t>
+            </w:r>
+            <w:proofErr w:type="spellEnd"/>
+            <w:r>
+              <w:t>(R)</w:t>
             </w:r>
           </w:p>
         </w:tc>
@@ -42060,7 +42906,15 @@
           </w:tcPr>
           <w:p>
             <w:r>
-              <w:t>B := (Ux &lt; Uy);</w:t>
+              <w:t>B := (</w:t>
+            </w:r>
+            <w:proofErr w:type="spellStart"/>
+            <w:r>
+              <w:t>Ux</w:t>
+            </w:r>
+            <w:proofErr w:type="spellEnd"/>
+            <w:r>
+              <w:t xml:space="preserve"> &lt; Uy);</w:t>
             </w:r>
           </w:p>
         </w:tc>
@@ -42076,7 +42930,15 @@
           </w:p>
           <w:p>
             <w:r>
-              <w:t>Stack Ux; Stack Uy; Stack-Unsigned-Condition BLT</w:t>
+              <w:t xml:space="preserve">Stack </w:t>
+            </w:r>
+            <w:proofErr w:type="spellStart"/>
+            <w:r>
+              <w:t>Ux</w:t>
+            </w:r>
+            <w:proofErr w:type="spellEnd"/>
+            <w:r>
+              <w:t>; Stack Uy; Stack-Unsigned-Condition BLT</w:t>
             </w:r>
           </w:p>
           <w:p>
@@ -42410,7 +43272,15 @@
           </w:tcPr>
           <w:p>
             <w:r>
-              <w:t>If B Then DoItNow;</w:t>
+              <w:t xml:space="preserve">If B Then </w:t>
+            </w:r>
+            <w:proofErr w:type="spellStart"/>
+            <w:r>
+              <w:t>DoItNow</w:t>
+            </w:r>
+            <w:proofErr w:type="spellEnd"/>
+            <w:r>
+              <w:t>;</w:t>
             </w:r>
           </w:p>
         </w:tc>
@@ -42426,7 +43296,15 @@
           </w:p>
           <w:p>
             <w:r>
-              <w:t>Stack DoItNow; Call</w:t>
+              <w:t xml:space="preserve">Stack </w:t>
+            </w:r>
+            <w:proofErr w:type="spellStart"/>
+            <w:r>
+              <w:t>DoItNow</w:t>
+            </w:r>
+            <w:proofErr w:type="spellEnd"/>
+            <w:r>
+              <w:t>; Call</w:t>
             </w:r>
           </w:p>
           <w:p>
@@ -42665,8 +43543,13 @@
             </w:r>
           </w:p>
           <w:p>
-            <w:r>
-              <w:t>Bt 31</w:t>
+            <w:proofErr w:type="spellStart"/>
+            <w:r>
+              <w:t>Bt</w:t>
+            </w:r>
+            <w:proofErr w:type="spellEnd"/>
+            <w:r>
+              <w:t xml:space="preserve"> 31</w:t>
             </w:r>
           </w:p>
           <w:p>
@@ -43056,8 +43939,21 @@
             <w:gridSpan w:val="2"/>
           </w:tcPr>
           <w:p>
-            <w:r>
-              <w:t>Byteval := Bigval;</w:t>
+            <w:proofErr w:type="spellStart"/>
+            <w:r>
+              <w:t>Byteval</w:t>
+            </w:r>
+            <w:proofErr w:type="spellEnd"/>
+            <w:r>
+              <w:t xml:space="preserve"> := </w:t>
+            </w:r>
+            <w:proofErr w:type="spellStart"/>
+            <w:r>
+              <w:t>Bigval</w:t>
+            </w:r>
+            <w:proofErr w:type="spellEnd"/>
+            <w:r>
+              <w:t>;</w:t>
             </w:r>
           </w:p>
         </w:tc>
@@ -43068,13 +43964,31 @@
           </w:tcPr>
           <w:p>
             <w:r>
-              <w:t>Stack Byteval</w:t>
-            </w:r>
-          </w:p>
-          <w:p>
-            <w:r>
-              <w:t>Stack Bigval; Test-Range Byterange</w:t>
-            </w:r>
+              <w:t xml:space="preserve">Stack </w:t>
+            </w:r>
+            <w:proofErr w:type="spellStart"/>
+            <w:r>
+              <w:t>Byteval</w:t>
+            </w:r>
+            <w:proofErr w:type="spellEnd"/>
+          </w:p>
+          <w:p>
+            <w:r>
+              <w:t xml:space="preserve">Stack </w:t>
+            </w:r>
+            <w:proofErr w:type="spellStart"/>
+            <w:r>
+              <w:t>Bigval</w:t>
+            </w:r>
+            <w:proofErr w:type="spellEnd"/>
+            <w:r>
+              <w:t xml:space="preserve">; Test-Range </w:t>
+            </w:r>
+            <w:proofErr w:type="spellStart"/>
+            <w:r>
+              <w:t>Byterange</w:t>
+            </w:r>
+            <w:proofErr w:type="spellEnd"/>
           </w:p>
           <w:p>
             <w:r>
@@ -43123,10 +44037,12 @@
               <w:pStyle w:val="Heading3"/>
             </w:pPr>
             <w:bookmarkStart w:id="127" w:name="_Toc193032423"/>
+            <w:proofErr w:type="spellStart"/>
             <w:r>
               <w:t>Trunc</w:t>
             </w:r>
             <w:bookmarkEnd w:id="127"/>
+            <w:proofErr w:type="spellEnd"/>
           </w:p>
         </w:tc>
         <w:tc>
@@ -43160,7 +44076,15 @@
           </w:tcPr>
           <w:p>
             <w:r>
-              <w:t>TOS is replaced by the value TRUNC(TOS) where TRUNC is as defined in section 6.6.6.3 of the Pascal standard BS 6192:1982, with the extension that Trunc returns the value of its parameter if that value is already an integer.</w:t>
+              <w:t xml:space="preserve">TOS is replaced by the value TRUNC(TOS) where TRUNC is as defined in section 6.6.6.3 of the Pascal standard BS 6192:1982, with the extension that </w:t>
+            </w:r>
+            <w:proofErr w:type="spellStart"/>
+            <w:r>
+              <w:t>Trunc</w:t>
+            </w:r>
+            <w:proofErr w:type="spellEnd"/>
+            <w:r>
+              <w:t xml:space="preserve"> returns the value of its parameter if that value is already an integer.</w:t>
             </w:r>
           </w:p>
         </w:tc>
@@ -43242,8 +44166,21 @@
             <w:tcW w:w="2552" w:type="dxa"/>
           </w:tcPr>
           <w:p>
-            <w:r>
-              <w:t>i := Trunc(r+0.1);</w:t>
+            <w:proofErr w:type="spellStart"/>
+            <w:r>
+              <w:t>i</w:t>
+            </w:r>
+            <w:proofErr w:type="spellEnd"/>
+            <w:r>
+              <w:t xml:space="preserve"> := </w:t>
+            </w:r>
+            <w:proofErr w:type="spellStart"/>
+            <w:r>
+              <w:t>Trunc</w:t>
+            </w:r>
+            <w:proofErr w:type="spellEnd"/>
+            <w:r>
+              <w:t>(r+0.1);</w:t>
             </w:r>
           </w:p>
         </w:tc>
@@ -43254,12 +44191,25 @@
           </w:tcPr>
           <w:p>
             <w:r>
-              <w:t>Stack i; Stack r; Real &lt;0.1&gt;; Add</w:t>
-            </w:r>
-          </w:p>
-          <w:p>
-            <w:r>
-              <w:t>Trunc; Assign-Value</w:t>
+              <w:t xml:space="preserve">Stack </w:t>
+            </w:r>
+            <w:proofErr w:type="spellStart"/>
+            <w:r>
+              <w:t>i</w:t>
+            </w:r>
+            <w:proofErr w:type="spellEnd"/>
+            <w:r>
+              <w:t>; Stack r; Real &lt;0.1&gt;; Add</w:t>
+            </w:r>
+          </w:p>
+          <w:p>
+            <w:proofErr w:type="spellStart"/>
+            <w:r>
+              <w:t>Trunc</w:t>
+            </w:r>
+            <w:proofErr w:type="spellEnd"/>
+            <w:r>
+              <w:t>; Assign-Value</w:t>
             </w:r>
           </w:p>
         </w:tc>
@@ -43479,8 +44429,13 @@
           </w:tcPr>
           <w:p>
             <w:r>
-              <w:t>Stack try</w:t>
-            </w:r>
+              <w:t xml:space="preserve">Stack </w:t>
+            </w:r>
+            <w:proofErr w:type="gramStart"/>
+            <w:r>
+              <w:t>try</w:t>
+            </w:r>
+            <w:proofErr w:type="gramEnd"/>
           </w:p>
           <w:p>
             <w:r>

</xml_diff>